<commit_message>
docs: benchmarking approach — add thesis and recent-study precedents [41]-[48]
Co-Authored-By: Claude Fable 5.1 <noreply@anthropic.com>
Claude-Session: https://claude.ai/code/session_013eyfQteHzXj9KHimYU5FZa
</commit_message>
<xml_diff>
--- a/docs/benchmarking-approach.docx
+++ b/docs/benchmarking-approach.docx
@@ -2,7 +2,7 @@
 <file path=word/document.xml><?xml version="1.0" encoding="utf-8"?>
 <w:document xmlns:w="http://schemas.openxmlformats.org/wordprocessingml/2006/main" xmlns:m="http://schemas.openxmlformats.org/officeDocument/2006/math" xmlns:r="http://schemas.openxmlformats.org/officeDocument/2006/relationships" xmlns:o="urn:schemas-microsoft-com:office:office" xmlns:v="urn:schemas-microsoft-com:vml" xmlns:w10="urn:schemas-microsoft-com:office:word" xmlns:a="http://schemas.openxmlformats.org/drawingml/2006/main" xmlns:pic="http://schemas.openxmlformats.org/drawingml/2006/picture" xmlns:wp="http://schemas.openxmlformats.org/drawingml/2006/wordprocessingDrawing">
   <w:body>
-    <w:bookmarkStart w:id="27" w:name="benchmarking-approach"/>
+    <w:bookmarkStart w:id="28" w:name="benchmarking-approach"/>
     <w:p>
       <w:pPr>
         <w:pStyle w:val="Heading1"/>
@@ -614,13 +614,62 @@
       </w:r>
     </w:p>
     <w:bookmarkEnd w:id="24"/>
-    <w:bookmarkStart w:id="26" w:name="limitations-i-will-report"/>
+    <w:bookmarkStart w:id="25" w:name="X6c2206a80891ee4191e732a18aa958ce10d94f7"/>
     <w:p>
       <w:pPr>
         <w:pStyle w:val="Heading2"/>
       </w:pPr>
       <w:r>
-        <w:t xml:space="preserve">6. Limitations I will report</w:t>
+        <w:t xml:space="preserve">7. Precedents from theses and recent studies</w:t>
+      </w:r>
+    </w:p>
+    <w:p>
+      <w:pPr>
+        <w:pStyle w:val="FirstParagraph"/>
+      </w:pPr>
+      <w:r>
+        <w:t xml:space="preserve">I looked for prior work that benchmarks in the way I do, with a preference for Irish theses. Yang’s DCU doctoral thesis [41] is the closest Irish precedent on method: it argues that benchmark results are only comparable when the features being measured are fixed and declared in advance, and builds an explicit evaluation methodology around that, which is the same reasoning behind GreenCode’s fixed rule catalogue, fixed dataset and stored environment snapshot. Together with Ferreira’s TU Dublin dissertation on environment sensitivity [23] and Connolly Bree’s UCD thesis on design-level energy effects [4], it forms the Irish strand of this work; I did not find a recent Irish thesis that benchmarks PostgreSQL query rewrites specifically, so the closer precedents are international.</w:t>
+      </w:r>
+    </w:p>
+    <w:p>
+      <w:pPr>
+        <w:pStyle w:val="BodyText"/>
+      </w:pPr>
+      <w:r>
+        <w:t xml:space="preserve">The most directly comparable is Cedeño et al. [42], who ran the 22 TPC-H queries on PostgreSQL and measured per-query energy on both client and server while applying optimisation strategies (indexing and compression), finding that indexing cut energy on most queries. Taipalus [43] measured PostgreSQL 16 throughput with pgbench and whole-system power under different logical designs, repeating each run three times from a cold reboot, and found normalisation changed energy per transaction by around 74 % — a reminder that schema and query shape, not only hardware, drive the energy figure. The question behind my H4 was asked directly by Niemann et al. [44], who ran TPC-H and the Star Schema Benchmark on PostgreSQL and concluded that faster queries generally did use less energy, and earlier by Tsirogiannis, Harizopoulos and Shah [45], whose SIGMOD study found that within a single server</w:t>
+      </w:r>
+      <w:r>
+        <w:t xml:space="preserve"> </w:t>
+      </w:r>
+      <w:r>
+        <w:t xml:space="preserve">“</w:t>
+      </w:r>
+      <w:r>
+        <w:t xml:space="preserve">the most energy-efficient configuration is typically the highest-performing one</w:t>
+      </w:r>
+      <w:r>
+        <w:t xml:space="preserve">”</w:t>
+      </w:r>
+      <w:r>
+        <w:t xml:space="preserve">. GreenCode tests that claim at the level of individual rewrites rather than whole workloads, and the intention-to-treat analysis is where it would show up if the claim fails for AI-generated code. Mahajan, Blakeney and Zong [46] measured query-level energy on MySQL, MongoDB and Cassandra with YCSB and showed that query-level optimisations alone saved energy without costing throughput, which is the premise my SQL half depends on.</w:t>
+      </w:r>
+    </w:p>
+    <w:p>
+      <w:pPr>
+        <w:pStyle w:val="BodyText"/>
+      </w:pPr>
+      <w:r>
+        <w:t xml:space="preserve">Two further studies shaped how I report numbers. Salunke and Ouda [47] built a small Python harness to compare PostgreSQL and MySQL, ran each query a hundred times and reported medians and percentiles rather than means — the same choice I make, for the same reason. Lindblom and Strandin’s Lund master’s thesis [48] is a good example of pgbench done carefully (separate client machine, hour-long runs repeated several times, one variable changed at a time) and also of why that style does not fit here: their effect sizes were fractions of a percent and needed long runs to resolve, whereas a query rewrite typically changes execution time by an order of magnitude and is better resolved by many short paired repetitions.</w:t>
+      </w:r>
+    </w:p>
+    <w:bookmarkEnd w:id="25"/>
+    <w:bookmarkStart w:id="27" w:name="limitations-i-will-report"/>
+    <w:p>
+      <w:pPr>
+        <w:pStyle w:val="Heading2"/>
+      </w:pPr>
+      <w:r>
+        <w:t xml:space="preserve">8. Limitations I will report</w:t>
       </w:r>
     </w:p>
     <w:p>
@@ -638,7 +687,7 @@
         </w:pict>
       </w:r>
     </w:p>
-    <w:bookmarkStart w:id="25" w:name="X2caaf39eac4f5216f0b448e33c8bd72c543a0a4"/>
+    <w:bookmarkStart w:id="26" w:name="X2caaf39eac4f5216f0b448e33c8bd72c543a0a4"/>
     <w:p>
       <w:pPr>
         <w:pStyle w:val="Heading3"/>
@@ -941,10 +990,268 @@
         <w:pStyle w:val="BodyText"/>
       </w:pPr>
       <w:r>
+        <w:t xml:space="preserve">[41] Q. Yang,</w:t>
+      </w:r>
+      <w:r>
+        <w:t xml:space="preserve"> </w:t>
+      </w:r>
+      <w:r>
+        <w:t xml:space="preserve">“</w:t>
+      </w:r>
+      <w:r>
+        <w:t xml:space="preserve">Benchmarking data warehouse architectures: A feature-based modelling and evaluation methodology,</w:t>
+      </w:r>
+      <w:r>
+        <w:t xml:space="preserve">”</w:t>
+      </w:r>
+      <w:r>
+        <w:t xml:space="preserve"> </w:t>
+      </w:r>
+      <w:r>
+        <w:t xml:space="preserve">Ph.D. thesis, School of Computing, Dublin City University, Dublin, Ireland, 2019. [Online]. Available: https://doras.dcu.ie/23739/</w:t>
+      </w:r>
+    </w:p>
+    <w:p>
+      <w:pPr>
+        <w:pStyle w:val="BodyText"/>
+      </w:pPr>
+      <w:r>
+        <w:t xml:space="preserve">[42] E. Cedeño, A. Aguilera, D. Muñante, J. Correia, L. Guerrero, C. Sivira, and Y. Cardinale,</w:t>
+      </w:r>
+      <w:r>
+        <w:t xml:space="preserve"> </w:t>
+      </w:r>
+      <w:r>
+        <w:t xml:space="preserve">“</w:t>
+      </w:r>
+      <w:r>
+        <w:t xml:space="preserve">An evaluation of the impact of end-to-end query optimization strategies on energy consumption,</w:t>
+      </w:r>
+      <w:r>
+        <w:t xml:space="preserve">”</w:t>
+      </w:r>
+      <w:r>
+        <w:t xml:space="preserve"> </w:t>
+      </w:r>
+      <w:r>
+        <w:t xml:space="preserve">in</w:t>
+      </w:r>
+      <w:r>
+        <w:t xml:space="preserve"> </w:t>
+      </w:r>
+      <w:r>
         <w:rPr>
           <w:iCs/>
           <w:i/>
         </w:rPr>
+        <w:t xml:space="preserve">Proc. 19th Int. Conf. Evaluation of Novel Approaches to Software Engineering (ENASE)</w:t>
+      </w:r>
+      <w:r>
+        <w:t xml:space="preserve">, vol. 1, 2024, pp. 657–665, doi: 10.5220/0012708000003687.</w:t>
+      </w:r>
+    </w:p>
+    <w:p>
+      <w:pPr>
+        <w:pStyle w:val="BodyText"/>
+      </w:pPr>
+      <w:r>
+        <w:t xml:space="preserve">[43] T. Taipalus,</w:t>
+      </w:r>
+      <w:r>
+        <w:t xml:space="preserve"> </w:t>
+      </w:r>
+      <w:r>
+        <w:t xml:space="preserve">“</w:t>
+      </w:r>
+      <w:r>
+        <w:t xml:space="preserve">On the effects of logical database design on database size, query complexity, query performance, and energy consumption,</w:t>
+      </w:r>
+      <w:r>
+        <w:t xml:space="preserve">”</w:t>
+      </w:r>
+      <w:r>
+        <w:t xml:space="preserve"> </w:t>
+      </w:r>
+      <w:r>
+        <w:t xml:space="preserve">arXiv:2501.07449, 2025.</w:t>
+      </w:r>
+    </w:p>
+    <w:p>
+      <w:pPr>
+        <w:pStyle w:val="BodyText"/>
+      </w:pPr>
+      <w:r>
+        <w:t xml:space="preserve">[44] R. Niemann, N. Korfiatis, R. Zicari, and R. Göbel,</w:t>
+      </w:r>
+      <w:r>
+        <w:t xml:space="preserve"> </w:t>
+      </w:r>
+      <w:r>
+        <w:t xml:space="preserve">“</w:t>
+      </w:r>
+      <w:r>
+        <w:t xml:space="preserve">Does query performance optimization lead to energy efficiency? A comparative analysis of energy efficiency of database operations under different workload scenarios,</w:t>
+      </w:r>
+      <w:r>
+        <w:t xml:space="preserve">”</w:t>
+      </w:r>
+      <w:r>
+        <w:t xml:space="preserve"> </w:t>
+      </w:r>
+      <w:r>
+        <w:t xml:space="preserve">arXiv:1303.4869, 2013.</w:t>
+      </w:r>
+    </w:p>
+    <w:p>
+      <w:pPr>
+        <w:pStyle w:val="BodyText"/>
+      </w:pPr>
+      <w:r>
+        <w:t xml:space="preserve">[45] D. Tsirogiannis, S. Harizopoulos, and M. A. Shah,</w:t>
+      </w:r>
+      <w:r>
+        <w:t xml:space="preserve"> </w:t>
+      </w:r>
+      <w:r>
+        <w:t xml:space="preserve">“</w:t>
+      </w:r>
+      <w:r>
+        <w:t xml:space="preserve">Analyzing the energy efficiency of a database server,</w:t>
+      </w:r>
+      <w:r>
+        <w:t xml:space="preserve">”</w:t>
+      </w:r>
+      <w:r>
+        <w:t xml:space="preserve"> </w:t>
+      </w:r>
+      <w:r>
+        <w:t xml:space="preserve">in</w:t>
+      </w:r>
+      <w:r>
+        <w:t xml:space="preserve"> </w:t>
+      </w:r>
+      <w:r>
+        <w:rPr>
+          <w:iCs/>
+          <w:i/>
+        </w:rPr>
+        <w:t xml:space="preserve">Proc. ACM SIGMOD Int. Conf. Management of Data</w:t>
+      </w:r>
+      <w:r>
+        <w:t xml:space="preserve">, 2010, pp. 231–242, doi: 10.1145/1807167.1807194.</w:t>
+      </w:r>
+    </w:p>
+    <w:p>
+      <w:pPr>
+        <w:pStyle w:val="BodyText"/>
+      </w:pPr>
+      <w:r>
+        <w:t xml:space="preserve">[46] D. Mahajan, C. Blakeney, and Z. Zong,</w:t>
+      </w:r>
+      <w:r>
+        <w:t xml:space="preserve"> </w:t>
+      </w:r>
+      <w:r>
+        <w:t xml:space="preserve">“</w:t>
+      </w:r>
+      <w:r>
+        <w:t xml:space="preserve">Improving the energy efficiency of relational and NoSQL databases via query optimizations,</w:t>
+      </w:r>
+      <w:r>
+        <w:t xml:space="preserve">”</w:t>
+      </w:r>
+      <w:r>
+        <w:t xml:space="preserve"> </w:t>
+      </w:r>
+      <w:r>
+        <w:rPr>
+          <w:iCs/>
+          <w:i/>
+        </w:rPr>
+        <w:t xml:space="preserve">Sustain. Comput.: Informat. Syst.</w:t>
+      </w:r>
+      <w:r>
+        <w:t xml:space="preserve">, vol. 22, pp. 120–133, 2019, doi: 10.1016/j.suscom.2019.01.017.</w:t>
+      </w:r>
+      <w:r>
+        <w:t xml:space="preserve"> </w:t>
+      </w:r>
+      <w:r>
+        <w:rPr>
+          <w:iCs/>
+          <w:i/>
+        </w:rPr>
+        <w:t xml:space="preserve">(Confirm volume/pages/DOI in Zotero; the underlying M.Sc. thesis is D. Mahajan, Texas State Univ., 2016, https://digital.library.txst.edu/items/e5a4418a-0a47-4fa8-baea-184279da3fb6.)</w:t>
+      </w:r>
+    </w:p>
+    <w:p>
+      <w:pPr>
+        <w:pStyle w:val="BodyText"/>
+      </w:pPr>
+      <w:r>
+        <w:t xml:space="preserve">[47] S. V. Salunke and A. Ouda,</w:t>
+      </w:r>
+      <w:r>
+        <w:t xml:space="preserve"> </w:t>
+      </w:r>
+      <w:r>
+        <w:t xml:space="preserve">“</w:t>
+      </w:r>
+      <w:r>
+        <w:t xml:space="preserve">A performance benchmark for the PostgreSQL and MySQL databases,</w:t>
+      </w:r>
+      <w:r>
+        <w:t xml:space="preserve">”</w:t>
+      </w:r>
+      <w:r>
+        <w:t xml:space="preserve"> </w:t>
+      </w:r>
+      <w:r>
+        <w:rPr>
+          <w:iCs/>
+          <w:i/>
+        </w:rPr>
+        <w:t xml:space="preserve">Future Internet</w:t>
+      </w:r>
+      <w:r>
+        <w:t xml:space="preserve">, vol. 16, no. 10, art. 382, 2024, doi: 10.3390/fi16100382.</w:t>
+      </w:r>
+    </w:p>
+    <w:p>
+      <w:pPr>
+        <w:pStyle w:val="BodyText"/>
+      </w:pPr>
+      <w:r>
+        <w:t xml:space="preserve">[48] M. Lindblom and F. Strandin,</w:t>
+      </w:r>
+      <w:r>
+        <w:t xml:space="preserve"> </w:t>
+      </w:r>
+      <w:r>
+        <w:t xml:space="preserve">“</w:t>
+      </w:r>
+      <w:r>
+        <w:t xml:space="preserve">Performance analysis and improvement of PostgreSQL,</w:t>
+      </w:r>
+      <w:r>
+        <w:t xml:space="preserve">”</w:t>
+      </w:r>
+      <w:r>
+        <w:t xml:space="preserve"> </w:t>
+      </w:r>
+      <w:r>
+        <w:t xml:space="preserve">M.Sc. thesis, Dept. Computer Science, Lund University, Lund, Sweden, 2015. [Online]. Available: https://lup.lub.lu.se/student-papers/record/4939915</w:t>
+      </w:r>
+    </w:p>
+    <w:p>
+      <w:pPr>
+        <w:pStyle w:val="BodyText"/>
+      </w:pPr>
+      <w:r>
+        <w:rPr>
+          <w:iCs/>
+          <w:i/>
+        </w:rPr>
         <w:t xml:space="preserve">Not used:</w:t>
       </w:r>
       <w:r>
@@ -972,9 +1279,9 @@
         <w:t xml:space="preserve">benchmarks agentic AI tasks, not database performance; the Drill/Presto and big-data reviews concern distributed analytics engines. I have left them out rather than cite them for decoration.</w:t>
       </w:r>
     </w:p>
-    <w:bookmarkEnd w:id="25"/>
     <w:bookmarkEnd w:id="26"/>
     <w:bookmarkEnd w:id="27"/>
+    <w:bookmarkEnd w:id="28"/>
     <w:sectPr/>
   </w:body>
 </w:document>

</xml_diff>

<commit_message>
docs: drop Gray Benchmark Handbook; renumber [35]-[47]
Co-Authored-By: Claude Fable 5.1 <noreply@anthropic.com>
Claude-Session: https://claude.ai/code/session_013eyfQteHzXj9KHimYU5FZa
</commit_message>
<xml_diff>
--- a/docs/benchmarking-approach.docx
+++ b/docs/benchmarking-approach.docx
@@ -53,7 +53,15 @@
         <w:t xml:space="preserve"> </w:t>
       </w:r>
       <w:r>
-        <w:t xml:space="preserve">question: how many transactions per second can this PostgreSQL installation sustain as concurrent clients are added, and where does latency break down [32], [33]. That tradition goes back to the Wisconsin benchmark of Bitton, DeWitt and Turbyfill [34], which first argued that database systems should be compared on a controlled, synthetic relation set rather than on anecdote, and to Gray’s</w:t>
+        <w:t xml:space="preserve">question: how many transactions per second can this PostgreSQL installation sustain as concurrent clients are added, and where does latency break down [32], [33]. That tradition goes back to the Wisconsin benchmark of Bitton, DeWitt and Turbyfill [34], which first argued that database systems should be compared on a controlled, synthetic relation set rather than on anecdote.</w:t>
+      </w:r>
+    </w:p>
+    <w:p>
+      <w:pPr>
+        <w:pStyle w:val="BodyText"/>
+      </w:pPr>
+      <w:r>
+        <w:t xml:space="preserve">GreenCode asks a narrower question. I am not comparing database engines or hardware; I am comparing two versions of the</w:t>
       </w:r>
       <w:r>
         <w:t xml:space="preserve"> </w:t>
@@ -63,21 +71,13 @@
           <w:iCs/>
           <w:i/>
         </w:rPr>
-        <w:t xml:space="preserve">Benchmark Handbook</w:t>
-      </w:r>
-      <w:r>
-        <w:t xml:space="preserve"> </w:t>
-      </w:r>
-      <w:r>
-        <w:t xml:space="preserve">[35], which set out the four properties a benchmark should have: relevance, portability, scalability and simplicity.</w:t>
-      </w:r>
-    </w:p>
-    <w:p>
-      <w:pPr>
-        <w:pStyle w:val="BodyText"/>
-      </w:pPr>
-      <w:r>
-        <w:t xml:space="preserve">GreenCode asks a narrower question. I am not comparing database engines or hardware; I am comparing two versions of the</w:t>
+        <w:t xml:space="preserve">same</w:t>
+      </w:r>
+      <w:r>
+        <w:t xml:space="preserve"> </w:t>
+      </w:r>
+      <w:r>
+        <w:t xml:space="preserve">query (or function) on the</w:t>
       </w:r>
       <w:r>
         <w:t xml:space="preserve"> </w:t>
@@ -93,22 +93,6 @@
         <w:t xml:space="preserve"> </w:t>
       </w:r>
       <w:r>
-        <w:t xml:space="preserve">query (or function) on the</w:t>
-      </w:r>
-      <w:r>
-        <w:t xml:space="preserve"> </w:t>
-      </w:r>
-      <w:r>
-        <w:rPr>
-          <w:iCs/>
-          <w:i/>
-        </w:rPr>
-        <w:t xml:space="preserve">same</w:t>
-      </w:r>
-      <w:r>
-        <w:t xml:space="preserve"> </w:t>
-      </w:r>
-      <w:r>
         <w:t xml:space="preserve">engine and machine, and asking whether the rewrite is faster, cheaper in resources and lower in energy, with enough confidence to say so. That is a paired, single-client, steady-state micro-benchmark, and the right precedent for it is not TPC-C but the work on statistically rigorous performance evaluation by Georges, Buytaert and Eeckhout [21] and the cautionary paper by Mytkowicz et al. on how easily measurement setups produce wrong conclusions [22]. Where the standard tools do matter is in the practices they encode — warm-up, steady-state, a fixed dataset, a known machine — which I have carried across.</w:t>
       </w:r>
     </w:p>
@@ -229,7 +213,7 @@
         <w:t xml:space="preserve"> </w:t>
       </w:r>
       <w:r>
-        <w:t xml:space="preserve">[36]: the data is part of the benchmark definition, not an incidental input. The shape of the data is deliberately modest. At this size the whole working set fits in PostgreSQL’s shared buffers after warm-up, so I am measuring query execution rather than disk I/O, which is the right thing for a project about rewriting queries. Leis et al. showed that optimiser quality depends heavily on data skew and join structure [37], so the dataset includes correlated keys and realistic status and country distributions rather than uniform noise. Python cases carry their own workload in the case file (</w:t>
+        <w:t xml:space="preserve">[35]: the data is part of the benchmark definition, not an incidental input. The shape of the data is deliberately modest. At this size the whole working set fits in PostgreSQL’s shared buffers after warm-up, so I am measuring query execution rather than disk I/O, which is the right thing for a project about rewriting queries. Leis et al. showed that optimiser quality depends heavily on data skew and join structure [36], so the dataset includes correlated keys and realistic status and country distributions rather than uniform noise. Python cases carry their own workload in the case file (</w:t>
       </w:r>
       <w:r>
         <w:rPr>
@@ -560,7 +544,7 @@
         <w:t xml:space="preserve">t</w:t>
       </w:r>
       <w:r>
-        <w:t xml:space="preserve">-test can be misleading [21], [38]. Across cases, speed-ups are combined with geometric means, because ratios are multiplicative, and the hypotheses are tested with paired Wilcoxon signed-rank tests on log ratios. I report the test both per-protocol (only cases verified under both conditions) and intention-to-treat (a rejected candidate scores no improvement), since the two answer different questions and can legitimately disagree.</w:t>
+        <w:t xml:space="preserve">-test can be misleading [21], [37]. Across cases, speed-ups are combined with geometric means, because ratios are multiplicative, and the hypotheses are tested with paired Wilcoxon signed-rank tests on log ratios. I report the test both per-protocol (only cases verified under both conditions) and intention-to-treat (a rejected candidate scores no improvement), since the two answer different questions and can legitimately disagree.</w:t>
       </w:r>
     </w:p>
     <w:bookmarkEnd w:id="23"/>
@@ -602,7 +586,7 @@
         <w:t xml:space="preserve"> </w:t>
       </w:r>
       <w:r>
-        <w:t xml:space="preserve">[39] lists the ways database comparisons go wrong — unequal warm-up, cold versus hot caches, different configurations, cherry-picked queries, and results reported without variance. Each of those has a specific countermeasure above: identical warm-up for both variants, hot cache for both, one configuration recorded in the snapshot, a fixed and published case set, and every sample retained. Kalibera and Jones [38] add that the number of repetitions should be chosen from the observed variance rather than guessed, which is why the coefficient of variation is stored and why the dashboard flags pairs whose confidence intervals overlap rather than declaring a winner.</w:t>
+        <w:t xml:space="preserve">[38] lists the ways database comparisons go wrong — unequal warm-up, cold versus hot caches, different configurations, cherry-picked queries, and results reported without variance. Each of those has a specific countermeasure above: identical warm-up for both variants, hot cache for both, one configuration recorded in the snapshot, a fixed and published case set, and every sample retained. Kalibera and Jones [37] add that the number of repetitions should be chosen from the observed variance rather than guessed, which is why the coefficient of variation is stored and why the dashboard flags pairs whose confidence intervals overlap rather than declaring a winner.</w:t>
       </w:r>
     </w:p>
     <w:p>
@@ -610,7 +594,7 @@
         <w:pStyle w:val="BodyText"/>
       </w:pPr>
       <w:r>
-        <w:t xml:space="preserve">Ferreira’s TU Dublin dissertation [23] is a useful local warning: the same JavaScript benchmarks moved substantially when only the environment configuration changed. The environment snapshot, the single-machine rule and the paired design are my answer to that. A recent comparison of raw SQL against an ORM on PostgreSQL [40] measured CPU, memory and execution time across a fixed set of query patterns, which is close to my own design and reinforces that execution time alone is not a sufficient metric.</w:t>
+        <w:t xml:space="preserve">Ferreira’s TU Dublin dissertation [23] is a useful local warning: the same JavaScript benchmarks moved substantially when only the environment configuration changed. The environment snapshot, the single-machine rule and the paired design are my answer to that. A recent comparison of raw SQL against an ORM on PostgreSQL [39] measured CPU, memory and execution time across a fixed set of query patterns, which is close to my own design and reinforces that execution time alone is not a sufficient metric.</w:t>
       </w:r>
     </w:p>
     <w:bookmarkEnd w:id="24"/>
@@ -628,7 +612,7 @@
         <w:pStyle w:val="FirstParagraph"/>
       </w:pPr>
       <w:r>
-        <w:t xml:space="preserve">I looked for prior work that benchmarks in the way I do, with a preference for Irish theses. Yang’s DCU doctoral thesis [41] is the closest Irish precedent on method: it argues that benchmark results are only comparable when the features being measured are fixed and declared in advance, and builds an explicit evaluation methodology around that, which is the same reasoning behind GreenCode’s fixed rule catalogue, fixed dataset and stored environment snapshot. Together with Ferreira’s TU Dublin dissertation on environment sensitivity [23] and Connolly Bree’s UCD thesis on design-level energy effects [4], it forms the Irish strand of this work; I did not find a recent Irish thesis that benchmarks PostgreSQL query rewrites specifically, so the closer precedents are international.</w:t>
+        <w:t xml:space="preserve">I looked for prior work that benchmarks in the way I do, with a preference for Irish theses. Yang’s DCU doctoral thesis [40] is the closest Irish precedent on method: it argues that benchmark results are only comparable when the features being measured are fixed and declared in advance, and builds an explicit evaluation methodology around that, which is the same reasoning behind GreenCode’s fixed rule catalogue, fixed dataset and stored environment snapshot. Together with Ferreira’s TU Dublin dissertation on environment sensitivity [23] and Connolly Bree’s UCD thesis on design-level energy effects [4], it forms the Irish strand of this work; I did not find a recent Irish thesis that benchmarks PostgreSQL query rewrites specifically, so the closer precedents are international.</w:t>
       </w:r>
     </w:p>
     <w:p>
@@ -636,7 +620,7 @@
         <w:pStyle w:val="BodyText"/>
       </w:pPr>
       <w:r>
-        <w:t xml:space="preserve">The most directly comparable is Cedeño et al. [42], who ran the 22 TPC-H queries on PostgreSQL and measured per-query energy on both client and server while applying optimisation strategies (indexing and compression), finding that indexing cut energy on most queries. Taipalus [43] measured PostgreSQL 16 throughput with pgbench and whole-system power under different logical designs, repeating each run three times from a cold reboot, and found normalisation changed energy per transaction by around 74 % — a reminder that schema and query shape, not only hardware, drive the energy figure. The question behind my H4 was asked directly by Niemann et al. [44], who ran TPC-H and the Star Schema Benchmark on PostgreSQL and concluded that faster queries generally did use less energy, and earlier by Tsirogiannis, Harizopoulos and Shah [45], whose SIGMOD study found that within a single server</w:t>
+        <w:t xml:space="preserve">The most directly comparable is Cedeño et al. [41], who ran the 22 TPC-H queries on PostgreSQL and measured per-query energy on both client and server while applying optimisation strategies (indexing and compression), finding that indexing cut energy on most queries. Taipalus [42] measured PostgreSQL 16 throughput with pgbench and whole-system power under different logical designs, repeating each run three times from a cold reboot, and found normalisation changed energy per transaction by around 74 % — a reminder that schema and query shape, not only hardware, drive the energy figure. The question behind my H4 was asked directly by Niemann et al. [43], who ran TPC-H and the Star Schema Benchmark on PostgreSQL and concluded that faster queries generally did use less energy, and earlier by Tsirogiannis, Harizopoulos and Shah [44], whose SIGMOD study found that within a single server</w:t>
       </w:r>
       <w:r>
         <w:t xml:space="preserve"> </w:t>
@@ -651,7 +635,7 @@
         <w:t xml:space="preserve">”</w:t>
       </w:r>
       <w:r>
-        <w:t xml:space="preserve">. GreenCode tests that claim at the level of individual rewrites rather than whole workloads, and the intention-to-treat analysis is where it would show up if the claim fails for AI-generated code. Mahajan, Blakeney and Zong [46] measured query-level energy on MySQL, MongoDB and Cassandra with YCSB and showed that query-level optimisations alone saved energy without costing throughput, which is the premise my SQL half depends on.</w:t>
+        <w:t xml:space="preserve">. GreenCode tests that claim at the level of individual rewrites rather than whole workloads, and the intention-to-treat analysis is where it would show up if the claim fails for AI-generated code. Mahajan, Blakeney and Zong [45] measured query-level energy on MySQL, MongoDB and Cassandra with YCSB and showed that query-level optimisations alone saved energy without costing throughput, which is the premise my SQL half depends on.</w:t>
       </w:r>
     </w:p>
     <w:p>
@@ -659,7 +643,7 @@
         <w:pStyle w:val="BodyText"/>
       </w:pPr>
       <w:r>
-        <w:t xml:space="preserve">Two further studies shaped how I report numbers. Salunke and Ouda [47] built a small Python harness to compare PostgreSQL and MySQL, ran each query a hundred times and reported medians and percentiles rather than means — the same choice I make, for the same reason. Lindblom and Strandin’s Lund master’s thesis [48] is a good example of pgbench done carefully (separate client machine, hour-long runs repeated several times, one variable changed at a time) and also of why that style does not fit here: their effect sizes were fractions of a percent and needed long runs to resolve, whereas a query rewrite typically changes execution time by an order of magnitude and is better resolved by many short paired repetitions.</w:t>
+        <w:t xml:space="preserve">Two further studies shaped how I report numbers. Salunke and Ouda [46] built a small Python harness to compare PostgreSQL and MySQL, ran each query a hundred times and reported medians and percentiles rather than means — the same choice I make, for the same reason. Lindblom and Strandin’s Lund master’s thesis [47] is a good example of pgbench done carefully (separate client machine, hour-long runs repeated several times, one variable changed at a time) and also of why that style does not fit here: their effect sizes were fractions of a percent and needed long runs to resolve, whereas a query rewrite typically changes execution time by an order of magnitude and is better resolved by many short paired repetitions.</w:t>
       </w:r>
     </w:p>
     <w:bookmarkEnd w:id="25"/>
@@ -794,7 +778,7 @@
         <w:pStyle w:val="BodyText"/>
       </w:pPr>
       <w:r>
-        <w:t xml:space="preserve">[35] J. Gray, Ed.,</w:t>
+        <w:t xml:space="preserve">[35] TPC,</w:t>
       </w:r>
       <w:r>
         <w:t xml:space="preserve"> </w:t>
@@ -804,10 +788,10 @@
           <w:iCs/>
           <w:i/>
         </w:rPr>
-        <w:t xml:space="preserve">The Benchmark Handbook for Database and Transaction Processing Systems</w:t>
-      </w:r>
-      <w:r>
-        <w:t xml:space="preserve">, 2nd ed. San Mateo, CA, USA: Morgan Kaufmann, 1993.</w:t>
+        <w:t xml:space="preserve">TPC Benchmark H (TPC-H) Standard Specification</w:t>
+      </w:r>
+      <w:r>
+        <w:t xml:space="preserve">, Rev. 3.0.1, Transaction Processing Performance Council, 2022. [Online]. Available: https://www.tpc.org/tpch/</w:t>
       </w:r>
     </w:p>
     <w:p>
@@ -815,7 +799,19 @@
         <w:pStyle w:val="BodyText"/>
       </w:pPr>
       <w:r>
-        <w:t xml:space="preserve">[36] TPC,</w:t>
+        <w:t xml:space="preserve">[36] V. Leis, A. Gubichev, A. Mirchev, P. Boncz, A. Kemper, and T. Neumann,</w:t>
+      </w:r>
+      <w:r>
+        <w:t xml:space="preserve"> </w:t>
+      </w:r>
+      <w:r>
+        <w:t xml:space="preserve">“</w:t>
+      </w:r>
+      <w:r>
+        <w:t xml:space="preserve">How good are query optimizers, really?,</w:t>
+      </w:r>
+      <w:r>
+        <w:t xml:space="preserve">”</w:t>
       </w:r>
       <w:r>
         <w:t xml:space="preserve"> </w:t>
@@ -825,10 +821,10 @@
           <w:iCs/>
           <w:i/>
         </w:rPr>
-        <w:t xml:space="preserve">TPC Benchmark H (TPC-H) Standard Specification</w:t>
-      </w:r>
-      <w:r>
-        <w:t xml:space="preserve">, Rev. 3.0.1, Transaction Processing Performance Council, 2022. [Online]. Available: https://www.tpc.org/tpch/</w:t>
+        <w:t xml:space="preserve">Proc. VLDB Endow.</w:t>
+      </w:r>
+      <w:r>
+        <w:t xml:space="preserve">, vol. 9, no. 3, pp. 204–215, 2015, doi: 10.14778/2850583.2850594.</w:t>
       </w:r>
     </w:p>
     <w:p>
@@ -836,7 +832,7 @@
         <w:pStyle w:val="BodyText"/>
       </w:pPr>
       <w:r>
-        <w:t xml:space="preserve">[37] V. Leis, A. Gubichev, A. Mirchev, P. Boncz, A. Kemper, and T. Neumann,</w:t>
+        <w:t xml:space="preserve">[37] T. Kalibera and R. Jones,</w:t>
       </w:r>
       <w:r>
         <w:t xml:space="preserve"> </w:t>
@@ -845,10 +841,16 @@
         <w:t xml:space="preserve">“</w:t>
       </w:r>
       <w:r>
-        <w:t xml:space="preserve">How good are query optimizers, really?,</w:t>
+        <w:t xml:space="preserve">Rigorous benchmarking in reasonable time,</w:t>
       </w:r>
       <w:r>
         <w:t xml:space="preserve">”</w:t>
+      </w:r>
+      <w:r>
+        <w:t xml:space="preserve"> </w:t>
+      </w:r>
+      <w:r>
+        <w:t xml:space="preserve">in</w:t>
       </w:r>
       <w:r>
         <w:t xml:space="preserve"> </w:t>
@@ -858,10 +860,10 @@
           <w:iCs/>
           <w:i/>
         </w:rPr>
-        <w:t xml:space="preserve">Proc. VLDB Endow.</w:t>
-      </w:r>
-      <w:r>
-        <w:t xml:space="preserve">, vol. 9, no. 3, pp. 204–215, 2015, doi: 10.14778/2850583.2850594.</w:t>
+        <w:t xml:space="preserve">Proc. Int. Symp. Memory Management (ISMM)</w:t>
+      </w:r>
+      <w:r>
+        <w:t xml:space="preserve">, 2013, pp. 63–74, doi: 10.1145/2464157.2464160.</w:t>
       </w:r>
     </w:p>
     <w:p>
@@ -869,7 +871,7 @@
         <w:pStyle w:val="BodyText"/>
       </w:pPr>
       <w:r>
-        <w:t xml:space="preserve">[38] T. Kalibera and R. Jones,</w:t>
+        <w:t xml:space="preserve">[38] M. Raasveldt, P. Holanda, T. Gubner, and H. Mühleisen,</w:t>
       </w:r>
       <w:r>
         <w:t xml:space="preserve"> </w:t>
@@ -878,7 +880,7 @@
         <w:t xml:space="preserve">“</w:t>
       </w:r>
       <w:r>
-        <w:t xml:space="preserve">Rigorous benchmarking in reasonable time,</w:t>
+        <w:t xml:space="preserve">Fair benchmarking considered difficult: Common pitfalls in database performance testing,</w:t>
       </w:r>
       <w:r>
         <w:t xml:space="preserve">”</w:t>
@@ -897,10 +899,10 @@
           <w:iCs/>
           <w:i/>
         </w:rPr>
-        <w:t xml:space="preserve">Proc. Int. Symp. Memory Management (ISMM)</w:t>
-      </w:r>
-      <w:r>
-        <w:t xml:space="preserve">, 2013, pp. 63–74, doi: 10.1145/2464157.2464160.</w:t>
+        <w:t xml:space="preserve">Proc. Workshop Testing Database Systems (DBTest)</w:t>
+      </w:r>
+      <w:r>
+        <w:t xml:space="preserve">, 2018, art. 2, doi: 10.1145/3209950.3209955.</w:t>
       </w:r>
     </w:p>
     <w:p>
@@ -908,7 +910,7 @@
         <w:pStyle w:val="BodyText"/>
       </w:pPr>
       <w:r>
-        <w:t xml:space="preserve">[39] M. Raasveldt, P. Holanda, T. Gubner, and H. Mühleisen,</w:t>
+        <w:t xml:space="preserve">[39]</w:t>
       </w:r>
       <w:r>
         <w:t xml:space="preserve"> </w:t>
@@ -917,16 +919,10 @@
         <w:t xml:space="preserve">“</w:t>
       </w:r>
       <w:r>
-        <w:t xml:space="preserve">Fair benchmarking considered difficult: Common pitfalls in database performance testing,</w:t>
+        <w:t xml:space="preserve">A performance analysis comparison of raw SQL and Prisma ORM,</w:t>
       </w:r>
       <w:r>
         <w:t xml:space="preserve">”</w:t>
-      </w:r>
-      <w:r>
-        <w:t xml:space="preserve"> </w:t>
-      </w:r>
-      <w:r>
-        <w:t xml:space="preserve">in</w:t>
       </w:r>
       <w:r>
         <w:t xml:space="preserve"> </w:t>
@@ -936,30 +932,10 @@
           <w:iCs/>
           <w:i/>
         </w:rPr>
-        <w:t xml:space="preserve">Proc. Workshop Testing Database Systems (DBTest)</w:t>
-      </w:r>
-      <w:r>
-        <w:t xml:space="preserve">, 2018, art. 2, doi: 10.1145/3209950.3209955.</w:t>
-      </w:r>
-    </w:p>
-    <w:p>
-      <w:pPr>
-        <w:pStyle w:val="BodyText"/>
-      </w:pPr>
-      <w:r>
-        <w:t xml:space="preserve">[40]</w:t>
-      </w:r>
-      <w:r>
-        <w:t xml:space="preserve"> </w:t>
-      </w:r>
-      <w:r>
-        <w:t xml:space="preserve">“</w:t>
-      </w:r>
-      <w:r>
-        <w:t xml:space="preserve">A performance analysis comparison of raw SQL and Prisma ORM,</w:t>
-      </w:r>
-      <w:r>
-        <w:t xml:space="preserve">”</w:t>
+        <w:t xml:space="preserve">Procedia Comput. Sci.</w:t>
+      </w:r>
+      <w:r>
+        <w:t xml:space="preserve">, 2025. [Online]. Available: https://www.sciencedirect.com/science/article/pii/S187705092502722X —</w:t>
       </w:r>
       <w:r>
         <w:t xml:space="preserve"> </w:t>
@@ -969,10 +945,59 @@
           <w:iCs/>
           <w:i/>
         </w:rPr>
-        <w:t xml:space="preserve">Procedia Comput. Sci.</w:t>
-      </w:r>
-      <w:r>
-        <w:t xml:space="preserve">, 2025. [Online]. Available: https://www.sciencedirect.com/science/article/pii/S187705092502722X —</w:t>
+        <w:t xml:space="preserve">check authors, volume and pages before citing.</w:t>
+      </w:r>
+    </w:p>
+    <w:p>
+      <w:pPr>
+        <w:pStyle w:val="BodyText"/>
+      </w:pPr>
+      <w:r>
+        <w:t xml:space="preserve">[40] Q. Yang,</w:t>
+      </w:r>
+      <w:r>
+        <w:t xml:space="preserve"> </w:t>
+      </w:r>
+      <w:r>
+        <w:t xml:space="preserve">“</w:t>
+      </w:r>
+      <w:r>
+        <w:t xml:space="preserve">Benchmarking data warehouse architectures: A feature-based modelling and evaluation methodology,</w:t>
+      </w:r>
+      <w:r>
+        <w:t xml:space="preserve">”</w:t>
+      </w:r>
+      <w:r>
+        <w:t xml:space="preserve"> </w:t>
+      </w:r>
+      <w:r>
+        <w:t xml:space="preserve">Ph.D. thesis, School of Computing, Dublin City University, Dublin, Ireland, 2019. [Online]. Available: https://doras.dcu.ie/23739/</w:t>
+      </w:r>
+    </w:p>
+    <w:p>
+      <w:pPr>
+        <w:pStyle w:val="BodyText"/>
+      </w:pPr>
+      <w:r>
+        <w:t xml:space="preserve">[41] E. Cedeño, A. Aguilera, D. Muñante, J. Correia, L. Guerrero, C. Sivira, and Y. Cardinale,</w:t>
+      </w:r>
+      <w:r>
+        <w:t xml:space="preserve"> </w:t>
+      </w:r>
+      <w:r>
+        <w:t xml:space="preserve">“</w:t>
+      </w:r>
+      <w:r>
+        <w:t xml:space="preserve">An evaluation of the impact of end-to-end query optimization strategies on energy consumption,</w:t>
+      </w:r>
+      <w:r>
+        <w:t xml:space="preserve">”</w:t>
+      </w:r>
+      <w:r>
+        <w:t xml:space="preserve"> </w:t>
+      </w:r>
+      <w:r>
+        <w:t xml:space="preserve">in</w:t>
       </w:r>
       <w:r>
         <w:t xml:space="preserve"> </w:t>
@@ -982,7 +1007,10 @@
           <w:iCs/>
           <w:i/>
         </w:rPr>
-        <w:t xml:space="preserve">check authors, volume and pages before citing.</w:t>
+        <w:t xml:space="preserve">Proc. 19th Int. Conf. Evaluation of Novel Approaches to Software Engineering (ENASE)</w:t>
+      </w:r>
+      <w:r>
+        <w:t xml:space="preserve">, vol. 1, 2024, pp. 657–665, doi: 10.5220/0012708000003687.</w:t>
       </w:r>
     </w:p>
     <w:p>
@@ -990,7 +1018,7 @@
         <w:pStyle w:val="BodyText"/>
       </w:pPr>
       <w:r>
-        <w:t xml:space="preserve">[41] Q. Yang,</w:t>
+        <w:t xml:space="preserve">[42] T. Taipalus,</w:t>
       </w:r>
       <w:r>
         <w:t xml:space="preserve"> </w:t>
@@ -999,7 +1027,7 @@
         <w:t xml:space="preserve">“</w:t>
       </w:r>
       <w:r>
-        <w:t xml:space="preserve">Benchmarking data warehouse architectures: A feature-based modelling and evaluation methodology,</w:t>
+        <w:t xml:space="preserve">On the effects of logical database design on database size, query complexity, query performance, and energy consumption,</w:t>
       </w:r>
       <w:r>
         <w:t xml:space="preserve">”</w:t>
@@ -1008,7 +1036,7 @@
         <w:t xml:space="preserve"> </w:t>
       </w:r>
       <w:r>
-        <w:t xml:space="preserve">Ph.D. thesis, School of Computing, Dublin City University, Dublin, Ireland, 2019. [Online]. Available: https://doras.dcu.ie/23739/</w:t>
+        <w:t xml:space="preserve">arXiv:2501.07449, 2025.</w:t>
       </w:r>
     </w:p>
     <w:p>
@@ -1016,7 +1044,7 @@
         <w:pStyle w:val="BodyText"/>
       </w:pPr>
       <w:r>
-        <w:t xml:space="preserve">[42] E. Cedeño, A. Aguilera, D. Muñante, J. Correia, L. Guerrero, C. Sivira, and Y. Cardinale,</w:t>
+        <w:t xml:space="preserve">[43] R. Niemann, N. Korfiatis, R. Zicari, and R. Göbel,</w:t>
       </w:r>
       <w:r>
         <w:t xml:space="preserve"> </w:t>
@@ -1025,7 +1053,33 @@
         <w:t xml:space="preserve">“</w:t>
       </w:r>
       <w:r>
-        <w:t xml:space="preserve">An evaluation of the impact of end-to-end query optimization strategies on energy consumption,</w:t>
+        <w:t xml:space="preserve">Does query performance optimization lead to energy efficiency? A comparative analysis of energy efficiency of database operations under different workload scenarios,</w:t>
+      </w:r>
+      <w:r>
+        <w:t xml:space="preserve">”</w:t>
+      </w:r>
+      <w:r>
+        <w:t xml:space="preserve"> </w:t>
+      </w:r>
+      <w:r>
+        <w:t xml:space="preserve">arXiv:1303.4869, 2013.</w:t>
+      </w:r>
+    </w:p>
+    <w:p>
+      <w:pPr>
+        <w:pStyle w:val="BodyText"/>
+      </w:pPr>
+      <w:r>
+        <w:t xml:space="preserve">[44] D. Tsirogiannis, S. Harizopoulos, and M. A. Shah,</w:t>
+      </w:r>
+      <w:r>
+        <w:t xml:space="preserve"> </w:t>
+      </w:r>
+      <w:r>
+        <w:t xml:space="preserve">“</w:t>
+      </w:r>
+      <w:r>
+        <w:t xml:space="preserve">Analyzing the energy efficiency of a database server,</w:t>
       </w:r>
       <w:r>
         <w:t xml:space="preserve">”</w:t>
@@ -1044,10 +1098,10 @@
           <w:iCs/>
           <w:i/>
         </w:rPr>
-        <w:t xml:space="preserve">Proc. 19th Int. Conf. Evaluation of Novel Approaches to Software Engineering (ENASE)</w:t>
-      </w:r>
-      <w:r>
-        <w:t xml:space="preserve">, vol. 1, 2024, pp. 657–665, doi: 10.5220/0012708000003687.</w:t>
+        <w:t xml:space="preserve">Proc. ACM SIGMOD Int. Conf. Management of Data</w:t>
+      </w:r>
+      <w:r>
+        <w:t xml:space="preserve">, 2010, pp. 231–242, doi: 10.1145/1807167.1807194.</w:t>
       </w:r>
     </w:p>
     <w:p>
@@ -1055,7 +1109,7 @@
         <w:pStyle w:val="BodyText"/>
       </w:pPr>
       <w:r>
-        <w:t xml:space="preserve">[43] T. Taipalus,</w:t>
+        <w:t xml:space="preserve">[45] D. Mahajan, C. Blakeney, and Z. Zong,</w:t>
       </w:r>
       <w:r>
         <w:t xml:space="preserve"> </w:t>
@@ -1064,68 +1118,10 @@
         <w:t xml:space="preserve">“</w:t>
       </w:r>
       <w:r>
-        <w:t xml:space="preserve">On the effects of logical database design on database size, query complexity, query performance, and energy consumption,</w:t>
+        <w:t xml:space="preserve">Improving the energy efficiency of relational and NoSQL databases via query optimizations,</w:t>
       </w:r>
       <w:r>
         <w:t xml:space="preserve">”</w:t>
-      </w:r>
-      <w:r>
-        <w:t xml:space="preserve"> </w:t>
-      </w:r>
-      <w:r>
-        <w:t xml:space="preserve">arXiv:2501.07449, 2025.</w:t>
-      </w:r>
-    </w:p>
-    <w:p>
-      <w:pPr>
-        <w:pStyle w:val="BodyText"/>
-      </w:pPr>
-      <w:r>
-        <w:t xml:space="preserve">[44] R. Niemann, N. Korfiatis, R. Zicari, and R. Göbel,</w:t>
-      </w:r>
-      <w:r>
-        <w:t xml:space="preserve"> </w:t>
-      </w:r>
-      <w:r>
-        <w:t xml:space="preserve">“</w:t>
-      </w:r>
-      <w:r>
-        <w:t xml:space="preserve">Does query performance optimization lead to energy efficiency? A comparative analysis of energy efficiency of database operations under different workload scenarios,</w:t>
-      </w:r>
-      <w:r>
-        <w:t xml:space="preserve">”</w:t>
-      </w:r>
-      <w:r>
-        <w:t xml:space="preserve"> </w:t>
-      </w:r>
-      <w:r>
-        <w:t xml:space="preserve">arXiv:1303.4869, 2013.</w:t>
-      </w:r>
-    </w:p>
-    <w:p>
-      <w:pPr>
-        <w:pStyle w:val="BodyText"/>
-      </w:pPr>
-      <w:r>
-        <w:t xml:space="preserve">[45] D. Tsirogiannis, S. Harizopoulos, and M. A. Shah,</w:t>
-      </w:r>
-      <w:r>
-        <w:t xml:space="preserve"> </w:t>
-      </w:r>
-      <w:r>
-        <w:t xml:space="preserve">“</w:t>
-      </w:r>
-      <w:r>
-        <w:t xml:space="preserve">Analyzing the energy efficiency of a database server,</w:t>
-      </w:r>
-      <w:r>
-        <w:t xml:space="preserve">”</w:t>
-      </w:r>
-      <w:r>
-        <w:t xml:space="preserve"> </w:t>
-      </w:r>
-      <w:r>
-        <w:t xml:space="preserve">in</w:t>
       </w:r>
       <w:r>
         <w:t xml:space="preserve"> </w:t>
@@ -1135,30 +1131,10 @@
           <w:iCs/>
           <w:i/>
         </w:rPr>
-        <w:t xml:space="preserve">Proc. ACM SIGMOD Int. Conf. Management of Data</w:t>
-      </w:r>
-      <w:r>
-        <w:t xml:space="preserve">, 2010, pp. 231–242, doi: 10.1145/1807167.1807194.</w:t>
-      </w:r>
-    </w:p>
-    <w:p>
-      <w:pPr>
-        <w:pStyle w:val="BodyText"/>
-      </w:pPr>
-      <w:r>
-        <w:t xml:space="preserve">[46] D. Mahajan, C. Blakeney, and Z. Zong,</w:t>
-      </w:r>
-      <w:r>
-        <w:t xml:space="preserve"> </w:t>
-      </w:r>
-      <w:r>
-        <w:t xml:space="preserve">“</w:t>
-      </w:r>
-      <w:r>
-        <w:t xml:space="preserve">Improving the energy efficiency of relational and NoSQL databases via query optimizations,</w:t>
-      </w:r>
-      <w:r>
-        <w:t xml:space="preserve">”</w:t>
+        <w:t xml:space="preserve">Sustain. Comput.: Informat. Syst.</w:t>
+      </w:r>
+      <w:r>
+        <w:t xml:space="preserve">, vol. 22, pp. 120–133, 2019, doi: 10.1016/j.suscom.2019.01.017.</w:t>
       </w:r>
       <w:r>
         <w:t xml:space="preserve"> </w:t>
@@ -1168,10 +1144,27 @@
           <w:iCs/>
           <w:i/>
         </w:rPr>
-        <w:t xml:space="preserve">Sustain. Comput.: Informat. Syst.</w:t>
-      </w:r>
-      <w:r>
-        <w:t xml:space="preserve">, vol. 22, pp. 120–133, 2019, doi: 10.1016/j.suscom.2019.01.017.</w:t>
+        <w:t xml:space="preserve">(Confirm volume/pages/DOI in Zotero; the underlying M.Sc. thesis is D. Mahajan, Texas State Univ., 2016, https://digital.library.txst.edu/items/e5a4418a-0a47-4fa8-baea-184279da3fb6.)</w:t>
+      </w:r>
+    </w:p>
+    <w:p>
+      <w:pPr>
+        <w:pStyle w:val="BodyText"/>
+      </w:pPr>
+      <w:r>
+        <w:t xml:space="preserve">[46] S. V. Salunke and A. Ouda,</w:t>
+      </w:r>
+      <w:r>
+        <w:t xml:space="preserve"> </w:t>
+      </w:r>
+      <w:r>
+        <w:t xml:space="preserve">“</w:t>
+      </w:r>
+      <w:r>
+        <w:t xml:space="preserve">A performance benchmark for the PostgreSQL and MySQL databases,</w:t>
+      </w:r>
+      <w:r>
+        <w:t xml:space="preserve">”</w:t>
       </w:r>
       <w:r>
         <w:t xml:space="preserve"> </w:t>
@@ -1181,7 +1174,10 @@
           <w:iCs/>
           <w:i/>
         </w:rPr>
-        <w:t xml:space="preserve">(Confirm volume/pages/DOI in Zotero; the underlying M.Sc. thesis is D. Mahajan, Texas State Univ., 2016, https://digital.library.txst.edu/items/e5a4418a-0a47-4fa8-baea-184279da3fb6.)</w:t>
+        <w:t xml:space="preserve">Future Internet</w:t>
+      </w:r>
+      <w:r>
+        <w:t xml:space="preserve">, vol. 16, no. 10, art. 382, 2024, doi: 10.3390/fi16100382.</w:t>
       </w:r>
     </w:p>
     <w:p>
@@ -1189,40 +1185,7 @@
         <w:pStyle w:val="BodyText"/>
       </w:pPr>
       <w:r>
-        <w:t xml:space="preserve">[47] S. V. Salunke and A. Ouda,</w:t>
-      </w:r>
-      <w:r>
-        <w:t xml:space="preserve"> </w:t>
-      </w:r>
-      <w:r>
-        <w:t xml:space="preserve">“</w:t>
-      </w:r>
-      <w:r>
-        <w:t xml:space="preserve">A performance benchmark for the PostgreSQL and MySQL databases,</w:t>
-      </w:r>
-      <w:r>
-        <w:t xml:space="preserve">”</w:t>
-      </w:r>
-      <w:r>
-        <w:t xml:space="preserve"> </w:t>
-      </w:r>
-      <w:r>
-        <w:rPr>
-          <w:iCs/>
-          <w:i/>
-        </w:rPr>
-        <w:t xml:space="preserve">Future Internet</w:t>
-      </w:r>
-      <w:r>
-        <w:t xml:space="preserve">, vol. 16, no. 10, art. 382, 2024, doi: 10.3390/fi16100382.</w:t>
-      </w:r>
-    </w:p>
-    <w:p>
-      <w:pPr>
-        <w:pStyle w:val="BodyText"/>
-      </w:pPr>
-      <w:r>
-        <w:t xml:space="preserve">[48] M. Lindblom and F. Strandin,</w:t>
+        <w:t xml:space="preserve">[47] M. Lindblom and F. Strandin,</w:t>
       </w:r>
       <w:r>
         <w:t xml:space="preserve"> </w:t>

</xml_diff>